<commit_message>
Piloto B2B al modelo vigente (Transformacion via carta de empresa, art. 3.5; empresa no paga): el docente cierra el convenio estandar y gerencia firma; formacion pagada = gerencia. Nuevo CONVENIO_HEIIU_BUSINESS_PARTNER_v1 (1 pag). Doc de agosto (65k) marcado como reemplazado
Co-Authored-By: Claude Fable 5.1 <noreply@anthropic.com>
</commit_message>
<xml_diff>
--- a/contratos/ANEXO_PILOTO_ALIANZAS_EMPRESARIALES_DOCENTE_v1.docx
+++ b/contratos/ANEXO_PILOTO_ALIANZAS_EMPRESARIALES_DOCENTE_v1.docx
@@ -56,7 +56,7 @@
         <w:rPr>
           <w:sz w:val="20"/>
         </w:rPr>
-        <w:t>EL CONTRATISTA, por iniciativa propia y de manera voluntaria, desarrollará durante el piloto actividades de apertura de alianzas con empresas y organizaciones para el programa de becas corporativas de la academia ("Becas [Empresa]" / Heiiu Business Partner): identificar empresas, contactar a sus decisores, presentar la propuesta institucional y entregar el material aprobado. Esta actividad es independiente de su labor docente, no es exclusiva y no implica subordinación: EL CONTRATISTA define sus horarios y medios, siempre por fuera de sus horas de clase programadas.</w:t>
+        <w:t>EL CONTRATISTA, por iniciativa propia y de manera voluntaria, desarrollará durante el piloto actividades de apertura de alianzas con empresas y organizaciones bajo el programa Heiiu Business Partner (acceso de los colaboradores de la empresa aliada a los beneficios del Fondo de Becas conforme a su Reglamento, artículo 3.5, y beneficio de convenio para los demás colaboradores; sin costo para la empresa): identificar empresas, contactar a sus decisores, presentar la propuesta institucional y entregar el material aprobado. Esta actividad es independiente de su labor docente, no es exclusiva y no implica subordinación: EL CONTRATISTA define sus horarios y medios, siempre por fuera de sus horas de clase programadas.</w:t>
       </w:r>
     </w:p>
     <w:p>
@@ -74,7 +74,7 @@
         <w:rPr>
           <w:sz w:val="20"/>
         </w:rPr>
-        <w:t>EL CONTRATISTA abre y presenta; NO negocia, NO cotiza, NO firma convenios ni promete condiciones. Usa exclusivamente el material, el tarifario y los términos de becas aprobados por gerencia. Toda empresa interesada en convenio de becas o en formación corporativa pagada se agenda con gerencia, que negocia y cierra. Las empresas que ya estén en conversación con la academia al inicio del piloto (listadas en el numeral 9) quedan excluidas del piloto.</w:t>
+        <w:t>EL CONTRATISTA abre, presenta y puede obtener la firma de la empresa en el convenio de alianza ESTÁNDAR aprobado por gerencia, sin modificar ninguna de sus condiciones; el convenio queda perfeccionado con la firma del representante legal de la academia. EL CONTRATISTA NO negocia, NO cotiza ni promete condiciones distintas del formato. Toda empresa interesada en formación corporativa pagada, o en condiciones fuera del formato, se agenda con gerencia, que negocia y cierra. Las empresas que ya estén en conversación con la academia al inicio del piloto (listadas en el numeral 9) quedan excluidas del piloto.</w:t>
       </w:r>
     </w:p>
     <w:p>

</xml_diff>

<commit_message>
B2B plan empresa: estandar 3-7 cupos lo cierra el docente (5%) con ORDEN_PLAN_EMPRESA_v1 (nuevo, 1 pag; contado o 30%+3 cuotas; copago); 8+ o a la medida = gerencia (3%); reglamento 3.6, convenio, propuesta, otrosi, tablero, condiciones, cuadro y dudas
Co-Authored-By: Claude Fable 5.1 <noreply@anthropic.com>
</commit_message>
<xml_diff>
--- a/contratos/ANEXO_PILOTO_ALIANZAS_EMPRESARIALES_DOCENTE_v1.docx
+++ b/contratos/ANEXO_PILOTO_ALIANZAS_EMPRESARIALES_DOCENTE_v1.docx
@@ -74,7 +74,7 @@
         <w:rPr>
           <w:sz w:val="20"/>
         </w:rPr>
-        <w:t>EL CONTRATISTA abre, presenta y puede obtener la firma de la empresa en el convenio de alianza ESTÁNDAR aprobado por gerencia, sin modificar ninguna de sus condiciones; el convenio queda perfeccionado con la firma del representante legal de la academia. EL CONTRATISTA NO negocia, NO cotiza ni promete condiciones distintas del formato. Toda empresa interesada en formación corporativa pagada, o en condiciones fuera del formato, se agenda con gerencia, que negocia y cierra. Las empresas que ya estén en conversación con la academia al inicio del piloto (listadas en el numeral 9) quedan excluidas del piloto.</w:t>
+        <w:t>EL CONTRATISTA abre, presenta y puede obtener la firma de la empresa en los dos formatos ESTÁNDAR aprobados por gerencia, sin modificar ninguna de sus condiciones: el convenio de alianza (Oferta A) y la orden del Plan Empresa de tres a siete cupos a tarifa corporativa (Oferta B); ambos quedan perfeccionados con la firma del representante legal de la academia. EL CONTRATISTA NO negocia, NO cotiza ni promete condiciones distintas de los formatos. Toda empresa que pida ocho cupos o más, clases en sus instalaciones, horarios propios, otros plazos o cualquier condición distinta, se agenda con gerencia, que negocia y cierra. Las empresas que ya estén en conversación con la academia al inicio del piloto (listadas en el numeral 9) quedan excluidas del piloto.</w:t>
       </w:r>
     </w:p>
     <w:p>
@@ -110,7 +110,7 @@
         <w:rPr>
           <w:sz w:val="20"/>
         </w:rPr>
-        <w:t>a) MATRÍCULAS POR ALIANZA: CINCO por ciento (5%) del recaudo de cada matrícula de estudiante nuevo que ingrese a la academia a través de un convenio de becas firmado con una empresa que EL CONTRATISTA registró y abrió, con independencia de quién conduzca la asesoría y el cierre. Aplica a las matrículas recibidas durante los doce (12) meses siguientes a la firma de cada convenio. b) FORMACIÓN CORPORATIVA: TRES por ciento (3%) del recaudo del primer año de un contrato de formación pagada celebrado con una empresa que EL CONTRATISTA registró, abrió y agendó con gerencia. c) Estas remuneraciones sustituyen, para las empresas del piloto, la de referido del contrato docente; no se acumulan entre sí ni con las del Anexo de Habilitación Comercial sobre el mismo recaudo.</w:t>
+        <w:t>a) MATRÍCULAS POR ALIANZA: CINCO por ciento (5%) del recaudo de cada matrícula de estudiante nuevo que ingrese a la academia a través de un convenio de becas firmado con una empresa que EL CONTRATISTA registró y abrió, con independencia de quién conduzca la asesoría y el cierre. Aplica a las matrículas recibidas durante los doce (12) meses siguientes a la firma de cada convenio. b) PLAN EMPRESA: CINCO por ciento (5%) del recaudo del primer año cuando EL CONTRATISTA cierra el Plan Empresa estándar (tres a siete cupos) con el formato aprobado; TRES por ciento (3%) del recaudo del primer año cuando la empresa que EL CONTRATISTA registró y abrió contrata un plan a la medida cerrado por gerencia. c) Estas remuneraciones sustituyen, para las empresas del piloto, la de referido del contrato docente; no se acumulan entre sí ni con las del Anexo de Habilitación Comercial sobre el mismo recaudo.</w:t>
       </w:r>
     </w:p>
     <w:p>

</xml_diff>